<commit_message>
Manuscript: SuperLearner and weighting margins at the RR-10 rerun (rank-loss ensemble ties the index; hapc, elastic net and lasso margins updated)
Co-Authored-By: Claude Fable 5.1 <noreply@anthropic.com>
</commit_message>
<xml_diff>
--- a/docs/manuscript_mcn_v2.docx
+++ b/docs/manuscript_mcn_v2.docx
@@ -6154,7 +6154,19 @@
         <w:t xml:space="preserve"> </w:t>
       </w:r>
       <w:r>
-        <w:t xml:space="preserve">beat it under any of four meta-learner losses (Supplement S1).</w:t>
+        <w:t xml:space="preserve">beat it under any of four meta-learner losses; the closest, an ensemble tuned</w:t>
+      </w:r>
+      <w:r>
+        <w:t xml:space="preserve"> </w:t>
+      </w:r>
+      <w:r>
+        <w:t xml:space="preserve">on a rank loss, ties it (0.30 against 0.31 on prevalence over the 17 cells</w:t>
+      </w:r>
+      <w:r>
+        <w:t xml:space="preserve"> </w:t>
+      </w:r>
+      <w:r>
+        <w:t xml:space="preserve">both scored) (Supplement S1).</w:t>
       </w:r>
     </w:p>
     <w:bookmarkEnd w:id="31"/>
@@ -10980,25 +10992,25 @@
         <w:t xml:space="preserve"> </w:t>
       </w:r>
       <w:r>
-        <w:t xml:space="preserve">ridge by 0.04 to 0.05 on the concentration in-fill, the elastic net and</w:t>
-      </w:r>
-      <w:r>
-        <w:t xml:space="preserve"> </w:t>
-      </w:r>
-      <w:r>
-        <w:t xml:space="preserve">lasso by 0.08, the one-standard-error penalty rule by 0.2 because it returns</w:t>
-      </w:r>
-      <w:r>
-        <w:t xml:space="preserve"> </w:t>
-      </w:r>
-      <w:r>
-        <w:t xml:space="preserve">the null model in a third of cells, and a highly adaptive ridge on the</w:t>
-      </w:r>
-      <w:r>
-        <w:t xml:space="preserve"> </w:t>
-      </w:r>
-      <w:r>
-        <w:t xml:space="preserve">components by 0.09 (Supplement S1). One variant ties the index exactly</w:t>
+        <w:t xml:space="preserve">ridge by 0.05 on the concentration in-fill, the elastic net and lasso by</w:t>
+      </w:r>
+      <w:r>
+        <w:t xml:space="preserve"> </w:t>
+      </w:r>
+      <w:r>
+        <w:t xml:space="preserve">0.06, the one-standard-error penalty rule by 0.2 because it returns the null</w:t>
+      </w:r>
+      <w:r>
+        <w:t xml:space="preserve"> </w:t>
+      </w:r>
+      <w:r>
+        <w:t xml:space="preserve">model in a third of cells, and a highly adaptive ridge on the components by</w:t>
+      </w:r>
+      <w:r>
+        <w:t xml:space="preserve"> </w:t>
+      </w:r>
+      <w:r>
+        <w:t xml:space="preserve">0.06 on prevalence (Supplement S1). One variant ties the index exactly</w:t>
       </w:r>
       <w:r>
         <w:t xml:space="preserve"> </w:t>

</xml_diff>

<commit_message>
Slop pass over the joint deck's slide text and the manuscript prose
Deck: two punchline titles rewritten as plain statements, one colon reveal and one "measured, not assumed" contrast rewritten, "truly worst quarter" made "the survey's worst quarter", the targeting title shortened to fit. Manuscript: nine sentences with "X, not Y" contrasts, a trailing -ing clause, empty "actually", and one cute lead-in rewritten as plain statements. Both re-rendered.

Co-Authored-By: Claude Fable 5.1 <noreply@anthropic.com>
</commit_message>
<xml_diff>
--- a/docs/manuscript_mcn_v2.docx
+++ b/docs/manuscript_mcn_v2.docx
@@ -23,7 +23,7 @@
         <w:pStyle w:val="Date"/>
       </w:pPr>
       <w:r>
-        <w:t xml:space="preserve">2026-09-10</w:t>
+        <w:t xml:space="preserve">2026-09-11</w:t>
       </w:r>
     </w:p>
     <w:p>
@@ -638,7 +638,7 @@
         <w:t xml:space="preserve"> </w:t>
       </w:r>
       <w:r>
-        <w:t xml:space="preserve">contributing to anaemia, impaired growth, immune dysfunction and adverse</w:t>
+        <w:t xml:space="preserve">and contribute to anaemia, impaired growth, immune dysfunction and adverse</w:t>
       </w:r>
       <w:r>
         <w:t xml:space="preserve"> </w:t>
@@ -914,7 +914,7 @@
         <w:t xml:space="preserve"> </w:t>
       </w:r>
       <w:r>
-        <w:t xml:space="preserve">scored against the cheapest alternative a programme actually has, against a</w:t>
+        <w:t xml:space="preserve">scored against the cheapest alternative a programme has, against a</w:t>
       </w:r>
       <w:r>
         <w:t xml:space="preserve"> </w:t>
@@ -3215,19 +3215,13 @@
         <w:t xml:space="preserve"> </w:t>
       </w:r>
       <w:r>
-        <w:t xml:space="preserve">unit. The precision of the district target, not the number of districts, is</w:t>
-      </w:r>
-      <w:r>
-        <w:t xml:space="preserve"> </w:t>
-      </w:r>
-      <w:r>
-        <w:t xml:space="preserve">the binding constraint on everything that follows, and Section 3 and Section</w:t>
-      </w:r>
-      <w:r>
-        <w:t xml:space="preserve"> </w:t>
-      </w:r>
-      <w:r>
-        <w:t xml:space="preserve">4.5 treat it explicitly.</w:t>
+        <w:t xml:space="preserve">unit. The precision of the district target is the binding constraint on</w:t>
+      </w:r>
+      <w:r>
+        <w:t xml:space="preserve"> </w:t>
+      </w:r>
+      <w:r>
+        <w:t xml:space="preserve">everything that follows; Sections 3 and 4.5 treat it explicitly.</w:t>
       </w:r>
     </w:p>
     <w:bookmarkEnd w:id="25"/>
@@ -3245,13 +3239,13 @@
         <w:pStyle w:val="FirstParagraph"/>
       </w:pPr>
       <w:r>
-        <w:t xml:space="preserve">Every predictor available at district resolution was assembled, not Earth</w:t>
-      </w:r>
-      <w:r>
-        <w:t xml:space="preserve"> </w:t>
-      </w:r>
-      <w:r>
-        <w:t xml:space="preserve">observation alone. The vocabulary in this version holds</w:t>
+        <w:t xml:space="preserve">We assembled every predictor available at district resolution, whatever its</w:t>
+      </w:r>
+      <w:r>
+        <w:t xml:space="preserve"> </w:t>
+      </w:r>
+      <w:r>
+        <w:t xml:space="preserve">source. The vocabulary in this version holds</w:t>
       </w:r>
       <w:r>
         <w:t xml:space="preserve"> </w:t>
@@ -5411,7 +5405,7 @@
         <w:t xml:space="preserve"> </w:t>
       </w:r>
       <w:r>
-        <w:t xml:space="preserve">mean, the only sub-national alternative a programme actually has, the domain</w:t>
+        <w:t xml:space="preserve">mean, the only sub-national alternative a programme has, the domain</w:t>
       </w:r>
       <w:r>
         <w:t xml:space="preserve"> </w:t>
@@ -7914,13 +7908,13 @@
         <w:t xml:space="preserve"> </w:t>
       </w:r>
       <w:r>
-        <w:t xml:space="preserve">that cost the index across borders in RR-10. The two importances answer different questions and</w:t>
-      </w:r>
-      <w:r>
-        <w:t xml:space="preserve"> </w:t>
-      </w:r>
-      <w:r>
-        <w:t xml:space="preserve">part where they should. The back-projection says what the fitted index</w:t>
+        <w:t xml:space="preserve">that cost the index across borders in RR-10. The two importances answer</w:t>
+      </w:r>
+      <w:r>
+        <w:t xml:space="preserve"> </w:t>
+      </w:r>
+      <w:r>
+        <w:t xml:space="preserve">different questions. The back-projection says what the fitted index</w:t>
       </w:r>
       <w:r>
         <w:t xml:space="preserve"> </w:t>
@@ -9416,13 +9410,13 @@
         <w:t xml:space="preserve"> </w:t>
       </w:r>
       <w:r>
-        <w:t xml:space="preserve">districts that a survey measures precisely, so the design is a level</w:t>
-      </w:r>
-      <w:r>
-        <w:t xml:space="preserve"> </w:t>
-      </w:r>
-      <w:r>
-        <w:t xml:space="preserve">calibration for a ranking, not a substitute for a survey.</w:t>
+        <w:t xml:space="preserve">districts that a survey measures precisely, so the design calibrates the</w:t>
+      </w:r>
+      <w:r>
+        <w:t xml:space="preserve"> </w:t>
+      </w:r>
+      <w:r>
+        <w:t xml:space="preserve">level of a ranking and does not substitute for a survey.</w:t>
       </w:r>
     </w:p>
     <w:tbl>
@@ -12524,13 +12518,13 @@
         <w:t xml:space="preserve"> </w:t>
       </w:r>
       <w:r>
-        <w:t xml:space="preserve">Sierra Leone vanished. Per-country coverage and per-country cell counts, not</w:t>
-      </w:r>
-      <w:r>
-        <w:t xml:space="preserve"> </w:t>
-      </w:r>
-      <w:r>
-        <w:t xml:space="preserve">totals, are the checks that found them.</w:t>
+        <w:t xml:space="preserve">Sierra Leone vanished. The checks that found them were per-country coverage</w:t>
+      </w:r>
+      <w:r>
+        <w:t xml:space="preserve"> </w:t>
+      </w:r>
+      <w:r>
+        <w:t xml:space="preserve">and per-country cell counts.</w:t>
       </w:r>
     </w:p>
     <w:bookmarkEnd w:id="51"/>
@@ -12560,7 +12554,7 @@
         <w:t xml:space="preserve"> </w:t>
       </w:r>
       <w:r>
-        <w:t xml:space="preserve">deliverable is a ranking, not a level: absolute prevalence differs between</w:t>
+        <w:t xml:space="preserve">deliverable is a ranking without a level: absolute prevalence differs between</w:t>
       </w:r>
       <w:r>
         <w:t xml:space="preserve"> </w:t>

</xml_diff>